<commit_message>
Trim Exam 1 materials and remove binary search
</commit_message>
<xml_diff>
--- a/exam1/diagnostic/answers.docx
+++ b/exam1/diagnostic/answers.docx
@@ -79,7 +79,7 @@
         <w:keepLines/>
       </w:pPr>
       <w:r>
-        <w:t>Binary search discards a region based on sorted order. On an unsorted list it may miss a value that is present, even though some searches succeed by chance.</w:t>
+        <w:t>Python lists support direct indexing. Reading the last item takes O(1) time regardless of how many items come before it.</w:t>
       </w:r>
     </w:p>
     <w:p>
@@ -95,7 +95,7 @@
         <w:keepLines/>
       </w:pPr>
       <w:r>
-        <w:t>In place describes where sorting happens and how much extra space it uses. Returning the original list is a separate requirement of this package's in-place sorting exercises.</w:t>
+        <w:t>In place describes where sorting happens and how much extra space it uses. Returning the original list is a separate requirement of the in-place sorting exercises here.</w:t>
       </w:r>
     </w:p>
     <w:p>
@@ -127,7 +127,7 @@
         <w:keepLines/>
       </w:pPr>
       <w:r>
-        <w:t>The inner work repeats n times for each of n outer iterations: n times n. B counts only one loop; A ignores repetition; D would need a shrinking search range or similar behavior.</w:t>
+        <w:t>The inner work repeats n times for each of n outer iterations: n times n. B counts only one loop; A ignores repetition; D would need repeated halving.</w:t>
       </w:r>
     </w:p>
     <w:p>
@@ -143,7 +143,7 @@
         <w:keepLines/>
       </w:pPr>
       <w:r>
-        <w:t>A full array must copy its n existing items into larger storage before adding the new item, so one append can take O(n). A ignores resizing; C adds an unnecessary second factor of n; D confuses resizing with halving a search range.</w:t>
+        <w:t>A full array must copy its n existing items into larger storage before adding the new item, so one append can take O(n). A ignores resizing; C adds an unnecessary second factor of n; D confuses resizing with halving.</w:t>
       </w:r>
     </w:p>
     <w:p>
@@ -359,7 +359,7 @@
           <w:rPr>
             <w:u w:val="single"/>
           </w:rPr>
-          <w:t>Topic 3 arrays and search</w:t>
+          <w:t>Topic 3 arrays and lists</w:t>
         </w:r>
       </w:hyperlink>
       <w:r>
@@ -402,14 +402,6 @@
       </w:hyperlink>
       <w:r>
         <w:t>, if included. Review array-to-tree mapping, then removal and sifting.</w:t>
-      </w:r>
-    </w:p>
-    <w:p>
-      <w:pPr>
-        <w:keepLines/>
-      </w:pPr>
-      <w:r>
-        <w:t>The topic folders are inside exam1/topics. Their review.md files teach the material; mock.md contains the questions. Keep these documents with the folder so their links can work.</w:t>
       </w:r>
     </w:p>
     <w:p>
@@ -1022,25 +1014,6 @@
       </w:r>
     </w:p>
     <w:p>
-      <w:pPr>
-        <w:keepLines/>
-      </w:pPr>
-      <w:r>
-        <w:t xml:space="preserve">For review, use </w:t>
-      </w:r>
-      <w:hyperlink r:id="rId13">
-        <w:r>
-          <w:rPr>
-            <w:u w:val="single"/>
-          </w:rPr>
-          <w:t>Topic 4</w:t>
-        </w:r>
-      </w:hyperlink>
-      <w:r>
-        <w:t>, especially “Where the growth rates come from”. Focus on worst-case derivations for this class session.</w:t>
-      </w:r>
-    </w:p>
-    <w:p>
       <w:r>
         <w:br w:type="page"/>
       </w:r>
@@ -1128,7 +1101,7 @@
         <w:pStyle w:val="Heading2"/>
       </w:pPr>
       <w:r>
-        <w:t>Arrays and search</w:t>
+        <w:t>Arrays and lists</w:t>
       </w:r>
     </w:p>
     <w:p>
@@ -1249,36 +1222,6 @@
       </w:pPr>
       <w:r>
         <w:t>If you can explain the retry, move to the matching coding task. If not, inspect one relevant hint or solution section, close it, and retry. Ask your TA with the exact step that confused you.</w:t>
-      </w:r>
-    </w:p>
-    <w:p>
-      <w:pPr>
-        <w:keepLines/>
-      </w:pPr>
-      <w:r>
-        <w:t xml:space="preserve">Finish with the </w:t>
-      </w:r>
-      <w:hyperlink r:id="rId15">
-        <w:r>
-          <w:rPr>
-            <w:u w:val="single"/>
-          </w:rPr>
-          <w:t>study paths</w:t>
-        </w:r>
-      </w:hyperlink>
-      <w:r>
-        <w:t xml:space="preserve"> and </w:t>
-      </w:r>
-      <w:hyperlink r:id="rId16">
-        <w:r>
-          <w:rPr>
-            <w:u w:val="single"/>
-          </w:rPr>
-          <w:t>mixed readiness check</w:t>
-        </w:r>
-      </w:hyperlink>
-      <w:r>
-        <w:t>.</w:t>
       </w:r>
     </w:p>
     <w:sectPr>

</xml_diff>